<commit_message>
docs: Add repo README, ML code, and docs for judges
</commit_message>
<xml_diff>
--- a/docs/csao_solution_final.docx
+++ b/docs/csao_solution_final.docx
@@ -16965,6 +16965,38 @@
     </w:p>
     <w:p>
       <w:pPr>
+        <w:spacing w:before="120" w:after="40" w:line="276" w:lineRule="auto"/>
+      </w:pPr>
+      <w:r>
+        <w:rPr>
+          <w:rFonts w:ascii="Aptos" w:hAnsi="Aptos"/>
+          <w:b w:val="0"/>
+          <w:i w:val="0"/>
+          <w:color w:val="333333"/>
+          <w:sz w:val="22"/>
+          <w:rFonts w:eastAsia="Aptos"/>
+        </w:rPr>
+        <w:t xml:space="preserve">A live interactive proof-of-concept is deployed at: </w:t>
+      </w:r>
+    </w:p>
+    <w:p>
+      <w:pPr>
+        <w:spacing w:before="120" w:after="200" w:line="276" w:lineRule="auto"/>
+      </w:pPr>
+      <w:r>
+        <w:rPr>
+          <w:rFonts w:ascii="Aptos" w:hAnsi="Aptos"/>
+          <w:b/>
+          <w:i w:val="0"/>
+          <w:color w:val="0066CC"/>
+          <w:sz w:val="22"/>
+          <w:rFonts w:eastAsia="Aptos"/>
+        </w:rPr>
+        <w:t>https://carto-demo.netlify.app</w:t>
+      </w:r>
+    </w:p>
+    <w:p>
+      <w:pPr>
         <w:spacing w:before="240" w:after="120" w:line="276" w:lineRule="auto"/>
         <w:jc w:val="left"/>
       </w:pPr>
@@ -19379,7 +19411,7 @@
           <w:sz w:val="22"/>
           <w:rFonts w:eastAsia="Aptos"/>
         </w:rPr>
-        <w:t>Kaggle Dataset: navdeepdhunna/csao-dataset-2</w:t>
+        <w:t>Kaggle Dataset: https://www.kaggle.com/datasets/navdeepdhunna/csao-dataset-2</w:t>
       </w:r>
     </w:p>
     <w:p>
@@ -19396,7 +19428,7 @@
           <w:sz w:val="22"/>
           <w:rFonts w:eastAsia="Aptos"/>
         </w:rPr>
-        <w:t>Public Kaggle Notebook: [to be embedded in final PDF submission]</w:t>
+        <w:t>Public Kaggle Code: https://www.kaggle.com/code/navdeepdhunna/carto</w:t>
       </w:r>
     </w:p>
     <w:p>
@@ -19413,7 +19445,24 @@
           <w:sz w:val="22"/>
           <w:rFonts w:eastAsia="Aptos"/>
         </w:rPr>
-        <w:t>Interactive Web Demo: FastAPI + React (localhost deployment)</w:t>
+        <w:t>GitHub Repository: https://github.com/NavdeepSingh0/Carto</w:t>
+      </w:r>
+    </w:p>
+    <w:p>
+      <w:pPr>
+        <w:pStyle w:val="ListBullet"/>
+        <w:spacing w:before="40" w:after="40" w:line="276" w:lineRule="auto"/>
+      </w:pPr>
+      <w:r>
+        <w:rPr>
+          <w:rFonts w:ascii="Aptos" w:hAnsi="Aptos"/>
+          <w:b w:val="0"/>
+          <w:i w:val="0"/>
+          <w:color w:val="333333"/>
+          <w:sz w:val="22"/>
+          <w:rFonts w:eastAsia="Aptos"/>
+        </w:rPr>
+        <w:t>Interactive Web Demo: https://carto-demo.netlify.app</w:t>
       </w:r>
     </w:p>
     <w:p>

</xml_diff>